<commit_message>
Documentation updated + File restructure
Documentation updated with inclusion of mockups. Mockup raw images also uploaded. ICE Task 2 completed.
</commit_message>
<xml_diff>
--- a/Documentation/PROG7311 POS System Planning.docx
+++ b/Documentation/PROG7311 POS System Planning.docx
@@ -2923,16 +2923,936 @@
     </w:p>
     <w:p>
       <w:pPr>
-        <w:pStyle w:val="VCText"/>
-        <w:rPr>
-          <w:sz w:val="28"/>
-          <w:szCs w:val="28"/>
-        </w:rPr>
-      </w:pPr>
+        <w:rPr>
+          <w:rFonts w:ascii="Calibri" w:hAnsi="Calibri"/>
+          <w:sz w:val="23"/>
+        </w:rPr>
+      </w:pPr>
+      <w:r>
+        <w:br w:type="page"/>
+      </w:r>
+    </w:p>
+    <w:p>
+      <w:pPr>
+        <w:pStyle w:val="VCHeading"/>
+      </w:pPr>
+      <w:r>
+        <w:lastRenderedPageBreak/>
+        <w:t>UI Design</w:t>
+      </w:r>
+    </w:p>
+    <w:p>
+      <w:pPr>
+        <w:pStyle w:val="VCText"/>
+      </w:pPr>
+      <w:r>
+        <w:t>The following mock-ups detail how the user interface will be constructed and serve as a basis for future development.</w:t>
+      </w:r>
+    </w:p>
+    <w:p>
+      <w:pPr>
+        <w:pStyle w:val="VCText"/>
+        <w:rPr>
+          <w:b/>
+          <w:bCs/>
+          <w:sz w:val="32"/>
+          <w:szCs w:val="32"/>
+        </w:rPr>
+      </w:pPr>
+      <w:r>
+        <w:rPr>
+          <w:b/>
+          <w:bCs/>
+          <w:sz w:val="32"/>
+          <w:szCs w:val="32"/>
+        </w:rPr>
+        <w:t>Login Portal</w:t>
+      </w:r>
+    </w:p>
+    <w:p>
+      <w:pPr>
+        <w:pStyle w:val="VCText"/>
+      </w:pPr>
+      <w:r>
+        <w:rPr>
+          <w:noProof/>
+        </w:rPr>
+        <w:drawing>
+          <wp:inline distT="0" distB="0" distL="0" distR="0" wp14:anchorId="369EC7D5" wp14:editId="3CE816E5">
+            <wp:extent cx="5731510" cy="3420745"/>
+            <wp:effectExtent l="0" t="0" r="2540" b="8255"/>
+            <wp:docPr id="1923067636" name="Picture 7"/>
+            <wp:cNvGraphicFramePr>
+              <a:graphicFrameLocks xmlns:a="http://schemas.openxmlformats.org/drawingml/2006/main" noChangeAspect="1"/>
+            </wp:cNvGraphicFramePr>
+            <a:graphic xmlns:a="http://schemas.openxmlformats.org/drawingml/2006/main">
+              <a:graphicData uri="http://schemas.openxmlformats.org/drawingml/2006/picture">
+                <pic:pic xmlns:pic="http://schemas.openxmlformats.org/drawingml/2006/picture">
+                  <pic:nvPicPr>
+                    <pic:cNvPr id="1923067636" name="Picture 1923067636"/>
+                    <pic:cNvPicPr/>
+                  </pic:nvPicPr>
+                  <pic:blipFill>
+                    <a:blip r:embed="rId10" cstate="print">
+                      <a:extLst>
+                        <a:ext uri="{28A0092B-C50C-407E-A947-70E740481C1C}">
+                          <a14:useLocalDpi xmlns:a14="http://schemas.microsoft.com/office/drawing/2010/main" val="0"/>
+                        </a:ext>
+                      </a:extLst>
+                    </a:blip>
+                    <a:stretch>
+                      <a:fillRect/>
+                    </a:stretch>
+                  </pic:blipFill>
+                  <pic:spPr>
+                    <a:xfrm>
+                      <a:off x="0" y="0"/>
+                      <a:ext cx="5731510" cy="3420745"/>
+                    </a:xfrm>
+                    <a:prstGeom prst="rect">
+                      <a:avLst/>
+                    </a:prstGeom>
+                  </pic:spPr>
+                </pic:pic>
+              </a:graphicData>
+            </a:graphic>
+          </wp:inline>
+        </w:drawing>
+      </w:r>
+    </w:p>
+    <w:p>
+      <w:pPr>
+        <w:pStyle w:val="VCText"/>
+        <w:rPr>
+          <w:i/>
+          <w:iCs/>
+        </w:rPr>
+      </w:pPr>
+      <w:r>
+        <w:rPr>
+          <w:i/>
+          <w:iCs/>
+        </w:rPr>
+        <w:t>Login Portal – Dark</w:t>
+      </w:r>
+    </w:p>
+    <w:p>
+      <w:pPr>
+        <w:pStyle w:val="VCText"/>
+        <w:rPr>
+          <w:i/>
+          <w:iCs/>
+        </w:rPr>
+      </w:pPr>
+    </w:p>
+    <w:p>
+      <w:pPr>
+        <w:pStyle w:val="VCText"/>
+        <w:rPr>
+          <w:i/>
+          <w:iCs/>
+        </w:rPr>
+      </w:pPr>
+      <w:r>
+        <w:rPr>
+          <w:i/>
+          <w:iCs/>
+          <w:noProof/>
+        </w:rPr>
+        <w:lastRenderedPageBreak/>
+        <w:drawing>
+          <wp:inline distT="0" distB="0" distL="0" distR="0" wp14:anchorId="56C506B6" wp14:editId="5583D0A4">
+            <wp:extent cx="5731510" cy="3523615"/>
+            <wp:effectExtent l="0" t="0" r="2540" b="635"/>
+            <wp:docPr id="544255376" name="Picture 8"/>
+            <wp:cNvGraphicFramePr>
+              <a:graphicFrameLocks xmlns:a="http://schemas.openxmlformats.org/drawingml/2006/main" noChangeAspect="1"/>
+            </wp:cNvGraphicFramePr>
+            <a:graphic xmlns:a="http://schemas.openxmlformats.org/drawingml/2006/main">
+              <a:graphicData uri="http://schemas.openxmlformats.org/drawingml/2006/picture">
+                <pic:pic xmlns:pic="http://schemas.openxmlformats.org/drawingml/2006/picture">
+                  <pic:nvPicPr>
+                    <pic:cNvPr id="544255376" name="Picture 544255376"/>
+                    <pic:cNvPicPr/>
+                  </pic:nvPicPr>
+                  <pic:blipFill>
+                    <a:blip r:embed="rId11" cstate="print">
+                      <a:extLst>
+                        <a:ext uri="{28A0092B-C50C-407E-A947-70E740481C1C}">
+                          <a14:useLocalDpi xmlns:a14="http://schemas.microsoft.com/office/drawing/2010/main" val="0"/>
+                        </a:ext>
+                      </a:extLst>
+                    </a:blip>
+                    <a:stretch>
+                      <a:fillRect/>
+                    </a:stretch>
+                  </pic:blipFill>
+                  <pic:spPr>
+                    <a:xfrm>
+                      <a:off x="0" y="0"/>
+                      <a:ext cx="5731510" cy="3523615"/>
+                    </a:xfrm>
+                    <a:prstGeom prst="rect">
+                      <a:avLst/>
+                    </a:prstGeom>
+                  </pic:spPr>
+                </pic:pic>
+              </a:graphicData>
+            </a:graphic>
+          </wp:inline>
+        </w:drawing>
+      </w:r>
+    </w:p>
+    <w:p>
+      <w:pPr>
+        <w:pStyle w:val="VCText"/>
+        <w:rPr>
+          <w:i/>
+          <w:iCs/>
+        </w:rPr>
+      </w:pPr>
+      <w:r>
+        <w:rPr>
+          <w:i/>
+          <w:iCs/>
+        </w:rPr>
+        <w:t>Login Portal – Light</w:t>
+      </w:r>
+    </w:p>
+    <w:p>
+      <w:pPr>
+        <w:pStyle w:val="VCText"/>
+        <w:rPr>
+          <w:i/>
+          <w:iCs/>
+        </w:rPr>
+      </w:pPr>
+    </w:p>
+    <w:p>
+      <w:pPr>
+        <w:rPr>
+          <w:rFonts w:ascii="Calibri" w:hAnsi="Calibri"/>
+          <w:i/>
+          <w:iCs/>
+          <w:sz w:val="23"/>
+        </w:rPr>
+      </w:pPr>
+      <w:r>
+        <w:rPr>
+          <w:i/>
+          <w:iCs/>
+        </w:rPr>
+        <w:br w:type="page"/>
+      </w:r>
+    </w:p>
+    <w:p>
+      <w:pPr>
+        <w:pStyle w:val="VCText"/>
+        <w:rPr>
+          <w:i/>
+          <w:iCs/>
+        </w:rPr>
+      </w:pPr>
+    </w:p>
+    <w:p>
+      <w:pPr>
+        <w:rPr>
+          <w:rFonts w:ascii="Calibri" w:hAnsi="Calibri"/>
+          <w:i/>
+          <w:iCs/>
+          <w:sz w:val="23"/>
+        </w:rPr>
+      </w:pPr>
+      <w:r>
+        <w:rPr>
+          <w:b/>
+          <w:bCs/>
+          <w:sz w:val="32"/>
+          <w:szCs w:val="32"/>
+        </w:rPr>
+        <w:t>Waitron Portal</w:t>
+      </w:r>
+    </w:p>
+    <w:p>
+      <w:pPr>
+        <w:pStyle w:val="VCText"/>
+      </w:pPr>
+      <w:r>
+        <w:rPr>
+          <w:noProof/>
+        </w:rPr>
+        <w:drawing>
+          <wp:inline distT="0" distB="0" distL="0" distR="0" wp14:anchorId="178BE038" wp14:editId="6E51DC78">
+            <wp:extent cx="5731510" cy="2915920"/>
+            <wp:effectExtent l="0" t="0" r="2540" b="0"/>
+            <wp:docPr id="44317091" name="Picture 9"/>
+            <wp:cNvGraphicFramePr>
+              <a:graphicFrameLocks xmlns:a="http://schemas.openxmlformats.org/drawingml/2006/main" noChangeAspect="1"/>
+            </wp:cNvGraphicFramePr>
+            <a:graphic xmlns:a="http://schemas.openxmlformats.org/drawingml/2006/main">
+              <a:graphicData uri="http://schemas.openxmlformats.org/drawingml/2006/picture">
+                <pic:pic xmlns:pic="http://schemas.openxmlformats.org/drawingml/2006/picture">
+                  <pic:nvPicPr>
+                    <pic:cNvPr id="44317091" name="Picture 44317091"/>
+                    <pic:cNvPicPr/>
+                  </pic:nvPicPr>
+                  <pic:blipFill>
+                    <a:blip r:embed="rId12" cstate="print">
+                      <a:extLst>
+                        <a:ext uri="{28A0092B-C50C-407E-A947-70E740481C1C}">
+                          <a14:useLocalDpi xmlns:a14="http://schemas.microsoft.com/office/drawing/2010/main" val="0"/>
+                        </a:ext>
+                      </a:extLst>
+                    </a:blip>
+                    <a:stretch>
+                      <a:fillRect/>
+                    </a:stretch>
+                  </pic:blipFill>
+                  <pic:spPr>
+                    <a:xfrm>
+                      <a:off x="0" y="0"/>
+                      <a:ext cx="5731510" cy="2915920"/>
+                    </a:xfrm>
+                    <a:prstGeom prst="rect">
+                      <a:avLst/>
+                    </a:prstGeom>
+                  </pic:spPr>
+                </pic:pic>
+              </a:graphicData>
+            </a:graphic>
+          </wp:inline>
+        </w:drawing>
+      </w:r>
+    </w:p>
+    <w:p>
+      <w:pPr>
+        <w:pStyle w:val="VCText"/>
+        <w:rPr>
+          <w:i/>
+          <w:iCs/>
+        </w:rPr>
+      </w:pPr>
+      <w:r>
+        <w:rPr>
+          <w:i/>
+          <w:iCs/>
+        </w:rPr>
+        <w:t>Waitron Portal – Table Overview</w:t>
+      </w:r>
+    </w:p>
+    <w:p>
+      <w:pPr>
+        <w:pStyle w:val="VCText"/>
+      </w:pPr>
+      <w:r>
+        <w:rPr>
+          <w:noProof/>
+        </w:rPr>
+        <w:drawing>
+          <wp:inline distT="0" distB="0" distL="0" distR="0" wp14:anchorId="76195407" wp14:editId="21EF2457">
+            <wp:extent cx="5731510" cy="2965450"/>
+            <wp:effectExtent l="0" t="0" r="2540" b="6350"/>
+            <wp:docPr id="1813597566" name="Picture 10"/>
+            <wp:cNvGraphicFramePr>
+              <a:graphicFrameLocks xmlns:a="http://schemas.openxmlformats.org/drawingml/2006/main" noChangeAspect="1"/>
+            </wp:cNvGraphicFramePr>
+            <a:graphic xmlns:a="http://schemas.openxmlformats.org/drawingml/2006/main">
+              <a:graphicData uri="http://schemas.openxmlformats.org/drawingml/2006/picture">
+                <pic:pic xmlns:pic="http://schemas.openxmlformats.org/drawingml/2006/picture">
+                  <pic:nvPicPr>
+                    <pic:cNvPr id="1813597566" name="Picture 1813597566"/>
+                    <pic:cNvPicPr/>
+                  </pic:nvPicPr>
+                  <pic:blipFill>
+                    <a:blip r:embed="rId13" cstate="print">
+                      <a:extLst>
+                        <a:ext uri="{28A0092B-C50C-407E-A947-70E740481C1C}">
+                          <a14:useLocalDpi xmlns:a14="http://schemas.microsoft.com/office/drawing/2010/main" val="0"/>
+                        </a:ext>
+                      </a:extLst>
+                    </a:blip>
+                    <a:stretch>
+                      <a:fillRect/>
+                    </a:stretch>
+                  </pic:blipFill>
+                  <pic:spPr>
+                    <a:xfrm>
+                      <a:off x="0" y="0"/>
+                      <a:ext cx="5731510" cy="2965450"/>
+                    </a:xfrm>
+                    <a:prstGeom prst="rect">
+                      <a:avLst/>
+                    </a:prstGeom>
+                  </pic:spPr>
+                </pic:pic>
+              </a:graphicData>
+            </a:graphic>
+          </wp:inline>
+        </w:drawing>
+      </w:r>
+    </w:p>
+    <w:p>
+      <w:pPr>
+        <w:pStyle w:val="VCText"/>
+        <w:rPr>
+          <w:i/>
+          <w:iCs/>
+        </w:rPr>
+      </w:pPr>
+      <w:r>
+        <w:rPr>
+          <w:i/>
+          <w:iCs/>
+        </w:rPr>
+        <w:t>Waitron Portal – Order Creation</w:t>
+      </w:r>
+    </w:p>
+    <w:p>
+      <w:pPr>
+        <w:pStyle w:val="VCText"/>
+        <w:rPr>
+          <w:i/>
+          <w:iCs/>
+        </w:rPr>
+      </w:pPr>
+    </w:p>
+    <w:p>
+      <w:pPr>
+        <w:rPr>
+          <w:rFonts w:ascii="Calibri" w:hAnsi="Calibri"/>
+          <w:i/>
+          <w:iCs/>
+          <w:sz w:val="23"/>
+        </w:rPr>
+      </w:pPr>
+      <w:r>
+        <w:rPr>
+          <w:i/>
+          <w:iCs/>
+        </w:rPr>
+        <w:br w:type="page"/>
+      </w:r>
+    </w:p>
+    <w:p>
+      <w:pPr>
+        <w:pStyle w:val="VCText"/>
+        <w:rPr>
+          <w:b/>
+          <w:bCs/>
+          <w:sz w:val="32"/>
+          <w:szCs w:val="32"/>
+        </w:rPr>
+      </w:pPr>
+      <w:r>
+        <w:rPr>
+          <w:b/>
+          <w:bCs/>
+          <w:sz w:val="32"/>
+          <w:szCs w:val="32"/>
+        </w:rPr>
+        <w:lastRenderedPageBreak/>
+        <w:t>Reservation Manager</w:t>
+      </w:r>
+    </w:p>
+    <w:p>
+      <w:pPr>
+        <w:pStyle w:val="VCText"/>
+        <w:rPr>
+          <w:i/>
+          <w:iCs/>
+        </w:rPr>
+      </w:pPr>
+      <w:r>
+        <w:rPr>
+          <w:b/>
+          <w:bCs/>
+          <w:noProof/>
+          <w:sz w:val="32"/>
+          <w:szCs w:val="32"/>
+        </w:rPr>
+        <w:drawing>
+          <wp:inline distT="0" distB="0" distL="0" distR="0" wp14:anchorId="383BC75D" wp14:editId="71429230">
+            <wp:extent cx="5731510" cy="3590925"/>
+            <wp:effectExtent l="0" t="0" r="2540" b="9525"/>
+            <wp:docPr id="1945249353" name="Picture 8"/>
+            <wp:cNvGraphicFramePr>
+              <a:graphicFrameLocks xmlns:a="http://schemas.openxmlformats.org/drawingml/2006/main" noChangeAspect="1"/>
+            </wp:cNvGraphicFramePr>
+            <a:graphic xmlns:a="http://schemas.openxmlformats.org/drawingml/2006/main">
+              <a:graphicData uri="http://schemas.openxmlformats.org/drawingml/2006/picture">
+                <pic:pic xmlns:pic="http://schemas.openxmlformats.org/drawingml/2006/picture">
+                  <pic:nvPicPr>
+                    <pic:cNvPr id="1945249353" name="Picture 1945249353"/>
+                    <pic:cNvPicPr/>
+                  </pic:nvPicPr>
+                  <pic:blipFill>
+                    <a:blip r:embed="rId14" cstate="print">
+                      <a:extLst>
+                        <a:ext uri="{28A0092B-C50C-407E-A947-70E740481C1C}">
+                          <a14:useLocalDpi xmlns:a14="http://schemas.microsoft.com/office/drawing/2010/main" val="0"/>
+                        </a:ext>
+                      </a:extLst>
+                    </a:blip>
+                    <a:stretch>
+                      <a:fillRect/>
+                    </a:stretch>
+                  </pic:blipFill>
+                  <pic:spPr>
+                    <a:xfrm>
+                      <a:off x="0" y="0"/>
+                      <a:ext cx="5731510" cy="3590925"/>
+                    </a:xfrm>
+                    <a:prstGeom prst="rect">
+                      <a:avLst/>
+                    </a:prstGeom>
+                  </pic:spPr>
+                </pic:pic>
+              </a:graphicData>
+            </a:graphic>
+          </wp:inline>
+        </w:drawing>
+      </w:r>
+      <w:r>
+        <w:rPr>
+          <w:i/>
+          <w:iCs/>
+        </w:rPr>
+        <w:t xml:space="preserve"> New Reservation Dark </w:t>
+      </w:r>
+    </w:p>
+    <w:p>
+      <w:pPr>
+        <w:pStyle w:val="VCText"/>
+        <w:rPr>
+          <w:i/>
+          <w:iCs/>
+        </w:rPr>
+      </w:pPr>
+      <w:r>
+        <w:drawing>
+          <wp:inline distT="0" distB="0" distL="0" distR="0" wp14:anchorId="4D82F454" wp14:editId="57910390">
+            <wp:extent cx="5731510" cy="3636645"/>
+            <wp:effectExtent l="0" t="0" r="2540" b="1905"/>
+            <wp:docPr id="647852367" name="Picture 7"/>
+            <wp:cNvGraphicFramePr>
+              <a:graphicFrameLocks xmlns:a="http://schemas.openxmlformats.org/drawingml/2006/main" noChangeAspect="1"/>
+            </wp:cNvGraphicFramePr>
+            <a:graphic xmlns:a="http://schemas.openxmlformats.org/drawingml/2006/main">
+              <a:graphicData uri="http://schemas.openxmlformats.org/drawingml/2006/picture">
+                <pic:pic xmlns:pic="http://schemas.openxmlformats.org/drawingml/2006/picture">
+                  <pic:nvPicPr>
+                    <pic:cNvPr id="647852367" name="Picture 647852367"/>
+                    <pic:cNvPicPr/>
+                  </pic:nvPicPr>
+                  <pic:blipFill>
+                    <a:blip r:embed="rId15" cstate="print">
+                      <a:extLst>
+                        <a:ext uri="{28A0092B-C50C-407E-A947-70E740481C1C}">
+                          <a14:useLocalDpi xmlns:a14="http://schemas.microsoft.com/office/drawing/2010/main" val="0"/>
+                        </a:ext>
+                      </a:extLst>
+                    </a:blip>
+                    <a:stretch>
+                      <a:fillRect/>
+                    </a:stretch>
+                  </pic:blipFill>
+                  <pic:spPr>
+                    <a:xfrm>
+                      <a:off x="0" y="0"/>
+                      <a:ext cx="5731510" cy="3636645"/>
+                    </a:xfrm>
+                    <a:prstGeom prst="rect">
+                      <a:avLst/>
+                    </a:prstGeom>
+                  </pic:spPr>
+                </pic:pic>
+              </a:graphicData>
+            </a:graphic>
+          </wp:inline>
+        </w:drawing>
+      </w:r>
+      <w:r>
+        <w:rPr>
+          <w:i/>
+          <w:iCs/>
+        </w:rPr>
+        <w:t>New Reservation - Light</w:t>
+      </w:r>
+    </w:p>
+    <w:p>
+      <w:pPr>
+        <w:pStyle w:val="VCText"/>
+        <w:rPr>
+          <w:i/>
+          <w:iCs/>
+        </w:rPr>
+      </w:pPr>
+      <w:r>
+        <w:rPr>
+          <w:noProof/>
+        </w:rPr>
+        <w:lastRenderedPageBreak/>
+        <w:drawing>
+          <wp:inline distT="0" distB="0" distL="0" distR="0" wp14:anchorId="28C1DAAE" wp14:editId="0876FB3D">
+            <wp:extent cx="5731510" cy="1670685"/>
+            <wp:effectExtent l="0" t="0" r="2540" b="5715"/>
+            <wp:docPr id="1124728562" name="Picture 9"/>
+            <wp:cNvGraphicFramePr>
+              <a:graphicFrameLocks xmlns:a="http://schemas.openxmlformats.org/drawingml/2006/main" noChangeAspect="1"/>
+            </wp:cNvGraphicFramePr>
+            <a:graphic xmlns:a="http://schemas.openxmlformats.org/drawingml/2006/main">
+              <a:graphicData uri="http://schemas.openxmlformats.org/drawingml/2006/picture">
+                <pic:pic xmlns:pic="http://schemas.openxmlformats.org/drawingml/2006/picture">
+                  <pic:nvPicPr>
+                    <pic:cNvPr id="1124728562" name="Picture 1124728562"/>
+                    <pic:cNvPicPr/>
+                  </pic:nvPicPr>
+                  <pic:blipFill>
+                    <a:blip r:embed="rId16" cstate="print">
+                      <a:extLst>
+                        <a:ext uri="{28A0092B-C50C-407E-A947-70E740481C1C}">
+                          <a14:useLocalDpi xmlns:a14="http://schemas.microsoft.com/office/drawing/2010/main" val="0"/>
+                        </a:ext>
+                      </a:extLst>
+                    </a:blip>
+                    <a:stretch>
+                      <a:fillRect/>
+                    </a:stretch>
+                  </pic:blipFill>
+                  <pic:spPr>
+                    <a:xfrm>
+                      <a:off x="0" y="0"/>
+                      <a:ext cx="5731510" cy="1670685"/>
+                    </a:xfrm>
+                    <a:prstGeom prst="rect">
+                      <a:avLst/>
+                    </a:prstGeom>
+                  </pic:spPr>
+                </pic:pic>
+              </a:graphicData>
+            </a:graphic>
+          </wp:inline>
+        </w:drawing>
+      </w:r>
+      <w:r>
+        <w:rPr>
+          <w:i/>
+          <w:iCs/>
+        </w:rPr>
+        <w:t>Reservation Manager – Light</w:t>
+      </w:r>
+    </w:p>
+    <w:p>
+      <w:pPr>
+        <w:pStyle w:val="VCText"/>
+        <w:rPr>
+          <w:i/>
+          <w:iCs/>
+        </w:rPr>
+      </w:pPr>
+      <w:r>
+        <w:rPr>
+          <w:noProof/>
+        </w:rPr>
+        <w:drawing>
+          <wp:inline distT="0" distB="0" distL="0" distR="0" wp14:anchorId="215A483E" wp14:editId="1A03378E">
+            <wp:extent cx="5731510" cy="1670050"/>
+            <wp:effectExtent l="0" t="0" r="2540" b="6350"/>
+            <wp:docPr id="24892248" name="Picture 10"/>
+            <wp:cNvGraphicFramePr>
+              <a:graphicFrameLocks xmlns:a="http://schemas.openxmlformats.org/drawingml/2006/main" noChangeAspect="1"/>
+            </wp:cNvGraphicFramePr>
+            <a:graphic xmlns:a="http://schemas.openxmlformats.org/drawingml/2006/main">
+              <a:graphicData uri="http://schemas.openxmlformats.org/drawingml/2006/picture">
+                <pic:pic xmlns:pic="http://schemas.openxmlformats.org/drawingml/2006/picture">
+                  <pic:nvPicPr>
+                    <pic:cNvPr id="24892248" name="Picture 24892248"/>
+                    <pic:cNvPicPr/>
+                  </pic:nvPicPr>
+                  <pic:blipFill>
+                    <a:blip r:embed="rId17" cstate="print">
+                      <a:extLst>
+                        <a:ext uri="{28A0092B-C50C-407E-A947-70E740481C1C}">
+                          <a14:useLocalDpi xmlns:a14="http://schemas.microsoft.com/office/drawing/2010/main" val="0"/>
+                        </a:ext>
+                      </a:extLst>
+                    </a:blip>
+                    <a:stretch>
+                      <a:fillRect/>
+                    </a:stretch>
+                  </pic:blipFill>
+                  <pic:spPr>
+                    <a:xfrm>
+                      <a:off x="0" y="0"/>
+                      <a:ext cx="5731510" cy="1670050"/>
+                    </a:xfrm>
+                    <a:prstGeom prst="rect">
+                      <a:avLst/>
+                    </a:prstGeom>
+                  </pic:spPr>
+                </pic:pic>
+              </a:graphicData>
+            </a:graphic>
+          </wp:inline>
+        </w:drawing>
+      </w:r>
+    </w:p>
+    <w:p>
+      <w:pPr>
+        <w:pStyle w:val="VCText"/>
+        <w:rPr>
+          <w:i/>
+          <w:iCs/>
+        </w:rPr>
+      </w:pPr>
+      <w:r>
+        <w:rPr>
+          <w:i/>
+          <w:iCs/>
+        </w:rPr>
+        <w:t>Reservation Manager – Dark</w:t>
+      </w:r>
+    </w:p>
+    <w:p>
+      <w:pPr>
+        <w:pStyle w:val="VCText"/>
+        <w:rPr>
+          <w:i/>
+          <w:iCs/>
+        </w:rPr>
+      </w:pPr>
+    </w:p>
+    <w:p>
+      <w:pPr>
+        <w:rPr>
+          <w:rFonts w:ascii="Calibri" w:hAnsi="Calibri"/>
+          <w:i/>
+          <w:iCs/>
+          <w:sz w:val="23"/>
+        </w:rPr>
+      </w:pPr>
+      <w:r>
+        <w:rPr>
+          <w:i/>
+          <w:iCs/>
+        </w:rPr>
+        <w:br w:type="page"/>
+      </w:r>
+    </w:p>
+    <w:p>
+      <w:pPr>
+        <w:pStyle w:val="VCText"/>
+        <w:rPr>
+          <w:b/>
+          <w:bCs/>
+          <w:sz w:val="32"/>
+          <w:szCs w:val="32"/>
+        </w:rPr>
+      </w:pPr>
+      <w:r>
+        <w:rPr>
+          <w:b/>
+          <w:bCs/>
+          <w:sz w:val="32"/>
+          <w:szCs w:val="32"/>
+        </w:rPr>
+        <w:lastRenderedPageBreak/>
+        <w:t>Sales Overview</w:t>
+      </w:r>
+    </w:p>
+    <w:p>
+      <w:pPr>
+        <w:pStyle w:val="VCText"/>
+      </w:pPr>
+      <w:r>
+        <w:rPr>
+          <w:noProof/>
+        </w:rPr>
+        <w:drawing>
+          <wp:inline distT="0" distB="0" distL="0" distR="0" wp14:anchorId="7FEAA382" wp14:editId="5917D5DE">
+            <wp:extent cx="4088130" cy="5695950"/>
+            <wp:effectExtent l="0" t="0" r="7620" b="0"/>
+            <wp:docPr id="571966565" name="Picture 11"/>
+            <wp:cNvGraphicFramePr>
+              <a:graphicFrameLocks xmlns:a="http://schemas.openxmlformats.org/drawingml/2006/main" noChangeAspect="1"/>
+            </wp:cNvGraphicFramePr>
+            <a:graphic xmlns:a="http://schemas.openxmlformats.org/drawingml/2006/main">
+              <a:graphicData uri="http://schemas.openxmlformats.org/drawingml/2006/picture">
+                <pic:pic xmlns:pic="http://schemas.openxmlformats.org/drawingml/2006/picture">
+                  <pic:nvPicPr>
+                    <pic:cNvPr id="571966565" name="Picture 571966565"/>
+                    <pic:cNvPicPr/>
+                  </pic:nvPicPr>
+                  <pic:blipFill rotWithShape="1">
+                    <a:blip r:embed="rId18">
+                      <a:extLst>
+                        <a:ext uri="{28A0092B-C50C-407E-A947-70E740481C1C}">
+                          <a14:useLocalDpi xmlns:a14="http://schemas.microsoft.com/office/drawing/2010/main" val="0"/>
+                        </a:ext>
+                      </a:extLst>
+                    </a:blip>
+                    <a:srcRect t="15547" b="20189"/>
+                    <a:stretch>
+                      <a:fillRect/>
+                    </a:stretch>
+                  </pic:blipFill>
+                  <pic:spPr bwMode="auto">
+                    <a:xfrm>
+                      <a:off x="0" y="0"/>
+                      <a:ext cx="4088130" cy="5695950"/>
+                    </a:xfrm>
+                    <a:prstGeom prst="rect">
+                      <a:avLst/>
+                    </a:prstGeom>
+                    <a:ln>
+                      <a:noFill/>
+                    </a:ln>
+                    <a:extLst>
+                      <a:ext uri="{53640926-AAD7-44D8-BBD7-CCE9431645EC}">
+                        <a14:shadowObscured xmlns:a14="http://schemas.microsoft.com/office/drawing/2010/main"/>
+                      </a:ext>
+                    </a:extLst>
+                  </pic:spPr>
+                </pic:pic>
+              </a:graphicData>
+            </a:graphic>
+          </wp:inline>
+        </w:drawing>
+      </w:r>
+    </w:p>
+    <w:p>
+      <w:pPr>
+        <w:pStyle w:val="VCText"/>
+        <w:rPr>
+          <w:i/>
+          <w:iCs/>
+        </w:rPr>
+      </w:pPr>
+      <w:r>
+        <w:rPr>
+          <w:i/>
+          <w:iCs/>
+        </w:rPr>
+        <w:t>Sales Overview – Light &amp; Dark</w:t>
+      </w:r>
+    </w:p>
+    <w:p>
+      <w:pPr>
+        <w:pStyle w:val="VCText"/>
+        <w:rPr>
+          <w:i/>
+          <w:iCs/>
+        </w:rPr>
+      </w:pPr>
+    </w:p>
+    <w:p>
+      <w:pPr>
+        <w:rPr>
+          <w:rFonts w:ascii="Calibri" w:hAnsi="Calibri"/>
+          <w:i/>
+          <w:iCs/>
+          <w:sz w:val="23"/>
+        </w:rPr>
+      </w:pPr>
+      <w:r>
+        <w:rPr>
+          <w:i/>
+          <w:iCs/>
+        </w:rPr>
+        <w:br w:type="page"/>
+      </w:r>
+    </w:p>
+    <w:p>
+      <w:pPr>
+        <w:pStyle w:val="VCText"/>
+        <w:rPr>
+          <w:b/>
+          <w:bCs/>
+          <w:sz w:val="32"/>
+          <w:szCs w:val="32"/>
+        </w:rPr>
+      </w:pPr>
+      <w:r>
+        <w:rPr>
+          <w:b/>
+          <w:bCs/>
+          <w:sz w:val="32"/>
+          <w:szCs w:val="32"/>
+        </w:rPr>
+        <w:lastRenderedPageBreak/>
+        <w:t>Manager Dashboard</w:t>
+      </w:r>
+    </w:p>
+    <w:p>
+      <w:pPr>
+        <w:pStyle w:val="VCText"/>
+      </w:pPr>
+      <w:r>
+        <w:rPr>
+          <w:noProof/>
+        </w:rPr>
+        <w:drawing>
+          <wp:inline distT="0" distB="0" distL="0" distR="0" wp14:anchorId="01D519B4" wp14:editId="1E31D95C">
+            <wp:extent cx="5731510" cy="3820795"/>
+            <wp:effectExtent l="0" t="0" r="2540" b="8255"/>
+            <wp:docPr id="1825434070" name="Picture 12"/>
+            <wp:cNvGraphicFramePr>
+              <a:graphicFrameLocks xmlns:a="http://schemas.openxmlformats.org/drawingml/2006/main" noChangeAspect="1"/>
+            </wp:cNvGraphicFramePr>
+            <a:graphic xmlns:a="http://schemas.openxmlformats.org/drawingml/2006/main">
+              <a:graphicData uri="http://schemas.openxmlformats.org/drawingml/2006/picture">
+                <pic:pic xmlns:pic="http://schemas.openxmlformats.org/drawingml/2006/picture">
+                  <pic:nvPicPr>
+                    <pic:cNvPr id="1825434070" name="Picture 1825434070"/>
+                    <pic:cNvPicPr/>
+                  </pic:nvPicPr>
+                  <pic:blipFill>
+                    <a:blip r:embed="rId19" cstate="print">
+                      <a:extLst>
+                        <a:ext uri="{28A0092B-C50C-407E-A947-70E740481C1C}">
+                          <a14:useLocalDpi xmlns:a14="http://schemas.microsoft.com/office/drawing/2010/main" val="0"/>
+                        </a:ext>
+                      </a:extLst>
+                    </a:blip>
+                    <a:stretch>
+                      <a:fillRect/>
+                    </a:stretch>
+                  </pic:blipFill>
+                  <pic:spPr>
+                    <a:xfrm>
+                      <a:off x="0" y="0"/>
+                      <a:ext cx="5731510" cy="3820795"/>
+                    </a:xfrm>
+                    <a:prstGeom prst="rect">
+                      <a:avLst/>
+                    </a:prstGeom>
+                  </pic:spPr>
+                </pic:pic>
+              </a:graphicData>
+            </a:graphic>
+          </wp:inline>
+        </w:drawing>
+      </w:r>
+    </w:p>
+    <w:p>
+      <w:pPr>
+        <w:pStyle w:val="VCText"/>
+        <w:rPr>
+          <w:i/>
+          <w:iCs/>
+        </w:rPr>
+      </w:pPr>
+      <w:r>
+        <w:rPr>
+          <w:i/>
+          <w:iCs/>
+        </w:rPr>
+        <w:t>Compilation of Manager views – Dark</w:t>
+      </w:r>
     </w:p>
     <w:sectPr>
-      <w:headerReference w:type="default" r:id="rId10"/>
-      <w:footerReference w:type="default" r:id="rId11"/>
+      <w:headerReference w:type="default" r:id="rId20"/>
+      <w:footerReference w:type="default" r:id="rId21"/>
       <w:pgSz w:w="11906" w:h="16838"/>
       <w:pgMar w:top="1440" w:right="1440" w:bottom="1440" w:left="1440" w:header="708" w:footer="708" w:gutter="0"/>
       <w:pgNumType w:start="0"/>
@@ -6393,7 +7313,10 @@
   <w:rsids>
     <w:rsidRoot w:val="00950556"/>
     <w:rsid w:val="000B3F7F"/>
+    <w:rsid w:val="001A516D"/>
     <w:rsid w:val="004F2373"/>
+    <w:rsid w:val="006D44AE"/>
+    <w:rsid w:val="007C0329"/>
     <w:rsid w:val="008171D7"/>
     <w:rsid w:val="008613B0"/>
     <w:rsid w:val="00950556"/>
@@ -6402,6 +7325,7 @@
     <w:rsid w:val="00C645EB"/>
     <w:rsid w:val="00EC7964"/>
     <w:rsid w:val="00F01194"/>
+    <w:rsid w:val="00FF6AD1"/>
   </w:rsids>
   <m:mathPr>
     <m:mathFont m:val="Cambria Math"/>

</xml_diff>